<commit_message>
Dolphins revision onto main: same 96 Dolphins files as 7253f04 on book-2-lectures-after-qed (full merge blocked by unrelated conflicts in Your First Book That Sells from a54769e)
</commit_message>
<xml_diff>
--- a/The Dolphins' View of History/chapters/01 - No Hands, No Cities - Why the Dolphins Only Watched.docx
+++ b/The Dolphins' View of History/chapters/01 - No Hands, No Cities - Why the Dolphins Only Watched.docx
@@ -58,7 +58,7 @@
         <w:spacing w:after="200"/>
       </w:pPr>
       <w:r>
-        <w:t xml:space="preserve">They hunt in coordinated teams and teach their young skills that vary by region — a genuine culture, not just instinct. In Shark Bay, Australia, a line of mothers has taught daughters for generations to break a marine sponge free and wear it over the nose while foraging on the sharp seafloor.</w:t>
+        <w:t xml:space="preserve">They hunt in coordinated teams and teach their young skills that vary by region — a genuine culture, not just instinct. In Shark Bay, Western Australia, a line of mothers has taught daughters for generations to break a marine sponge free and wear it over the nose while foraging on the sharp seafloor.</w:t>
       </w:r>
     </w:p>
     <w:p>
@@ -182,7 +182,7 @@
         <w:spacing w:after="200"/>
       </w:pPr>
       <w:r>
-        <w:t xml:space="preserve">None of which stops dolphins from doing, with some regularity, the opposite as well: helping humans lost or in danger at sea, guiding disoriented swimmers back toward shore, and, in a number of well-documented modern cases, circling threatened swimmers closely enough to drive off an approaching shark. Ancient Greek sailors told the same story about the same species nearly three thousand years ago — Arion, saved from drowning after pirates threw him overboard, was rescued by a dolphin often enough in the retelling that the image ended up stamped on Greek coins.</w:t>
+        <w:t xml:space="preserve">None of which stops dolphins from doing, now and then, the opposite as well: helping humans lost or in danger at sea, guiding disoriented swimmers toward shore, and, in a handful of widely reported modern cases, circling swimmers closely enough to keep an approaching shark away. These are the swimmers' accounts, not controlled experiments, and dolphin scholarship reports them as such. Greek writers told the same kind of story more than twenty-five centuries ago: Herodotus has the singer Arion thrown overboard by pirates and carried to shore on a dolphin's back, and the image of a rider on a dolphin ended up stamped on Greek coins.</w:t>
       </w:r>
     </w:p>
     <w:p>
@@ -202,7 +202,15 @@
         <w:spacing w:after="200"/>
       </w:pPr>
       <w:r>
-        <w:t xml:space="preserve">This is the thesis the rest of the book keeps testing, chapter after chapter, on the one species that did get the hands: a big brain guarantees cleverness. It does not guarantee wisdom. The two arrived on separate schedules, and the schedule for wisdom has been, and remains, the less reliable of the two.</w:t>
+        <w:t xml:space="preserve">Here is the thesis the rest of the book keeps testing on the one species that did get the hands. A hand turns an idea into an object, and an object outlives the person who had the idea. The next generation does not start from nothing. It picks up the tool, improves it, and passes it on. Anthropologists call this cumulative culture and compare it to a ratchet: it turns one way and rarely slips back. A dolphin calf inherits its mother's skills. A human child inherits a civilization's tools. Capability, in this species, compounds.</w:t>
+      </w:r>
+    </w:p>
+    <w:p>
+      <w:pPr>
+        <w:spacing w:after="200"/>
+      </w:pPr>
+      <w:r>
+        <w:t xml:space="preserve">Wisdom does not compound the same way. It cannot be stored in a tool or inherited with one. Each generation has to learn it again, mostly from its own mistakes and sometimes from its parents' graves. A big brain guarantees cleverness. It does not guarantee wisdom. The two arrive on separate schedules, and the rest of this book is the record of how far apart those schedules drifted.</w:t>
       </w:r>
     </w:p>
     <w:p>

</xml_diff>